<commit_message>
docs(HCO v2): fix List Number restart across all groups, remove OE sub-code from MOM.7 disclaimer
</commit_message>
<xml_diff>
--- a/policies/build/chapters_v2/MOM/HCO_MOM_10_v2_REWRITE_DRAFT.docx
+++ b/policies/build/chapters_v2/MOM/HCO_MOM_10_v2_REWRITE_DRAFT.docx
@@ -316,6 +316,10 @@
     </w:p>
     <w:p>
       <w:pPr>
+        <w:numPr>
+          <w:ilvl w:val="0"/>
+          <w:numId w:val="12"/>
+        </w:numPr>
         <w:pStyle w:val="ListNumber"/>
       </w:pPr>
       <w:r>
@@ -324,6 +328,10 @@
     </w:p>
     <w:p>
       <w:pPr>
+        <w:numPr>
+          <w:ilvl w:val="0"/>
+          <w:numId w:val="12"/>
+        </w:numPr>
         <w:pStyle w:val="ListNumber"/>
       </w:pPr>
       <w:r>
@@ -332,6 +340,10 @@
     </w:p>
     <w:p>
       <w:pPr>
+        <w:numPr>
+          <w:ilvl w:val="0"/>
+          <w:numId w:val="12"/>
+        </w:numPr>
         <w:pStyle w:val="ListNumber"/>
       </w:pPr>
       <w:r>
@@ -340,6 +352,10 @@
     </w:p>
     <w:p>
       <w:pPr>
+        <w:numPr>
+          <w:ilvl w:val="0"/>
+          <w:numId w:val="12"/>
+        </w:numPr>
         <w:pStyle w:val="ListNumber"/>
       </w:pPr>
       <w:r>
@@ -348,6 +364,10 @@
     </w:p>
     <w:p>
       <w:pPr>
+        <w:numPr>
+          <w:ilvl w:val="0"/>
+          <w:numId w:val="12"/>
+        </w:numPr>
         <w:pStyle w:val="ListNumber"/>
       </w:pPr>
       <w:r>
@@ -1336,6 +1356,10 @@
     </w:p>
     <w:p>
       <w:pPr>
+        <w:numPr>
+          <w:ilvl w:val="0"/>
+          <w:numId w:val="13"/>
+        </w:numPr>
         <w:pStyle w:val="ListNumber"/>
       </w:pPr>
       <w:r>
@@ -1344,6 +1368,10 @@
     </w:p>
     <w:p>
       <w:pPr>
+        <w:numPr>
+          <w:ilvl w:val="0"/>
+          <w:numId w:val="13"/>
+        </w:numPr>
         <w:pStyle w:val="ListNumber"/>
       </w:pPr>
       <w:r>
@@ -1352,6 +1380,10 @@
     </w:p>
     <w:p>
       <w:pPr>
+        <w:numPr>
+          <w:ilvl w:val="0"/>
+          <w:numId w:val="13"/>
+        </w:numPr>
         <w:pStyle w:val="ListNumber"/>
       </w:pPr>
       <w:r>
@@ -1368,6 +1400,10 @@
     </w:p>
     <w:p>
       <w:pPr>
+        <w:numPr>
+          <w:ilvl w:val="0"/>
+          <w:numId w:val="14"/>
+        </w:numPr>
         <w:pStyle w:val="ListNumber"/>
       </w:pPr>
       <w:r>
@@ -1376,6 +1412,10 @@
     </w:p>
     <w:p>
       <w:pPr>
+        <w:numPr>
+          <w:ilvl w:val="0"/>
+          <w:numId w:val="14"/>
+        </w:numPr>
         <w:pStyle w:val="ListNumber"/>
       </w:pPr>
       <w:r>
@@ -1384,6 +1424,10 @@
     </w:p>
     <w:p>
       <w:pPr>
+        <w:numPr>
+          <w:ilvl w:val="0"/>
+          <w:numId w:val="14"/>
+        </w:numPr>
         <w:pStyle w:val="ListNumber"/>
       </w:pPr>
       <w:r>
@@ -1400,6 +1444,10 @@
     </w:p>
     <w:p>
       <w:pPr>
+        <w:numPr>
+          <w:ilvl w:val="0"/>
+          <w:numId w:val="15"/>
+        </w:numPr>
         <w:pStyle w:val="ListNumber"/>
       </w:pPr>
       <w:r>
@@ -1408,6 +1456,10 @@
     </w:p>
     <w:p>
       <w:pPr>
+        <w:numPr>
+          <w:ilvl w:val="0"/>
+          <w:numId w:val="15"/>
+        </w:numPr>
         <w:pStyle w:val="ListNumber"/>
       </w:pPr>
       <w:r>
@@ -1424,6 +1476,10 @@
     </w:p>
     <w:p>
       <w:pPr>
+        <w:numPr>
+          <w:ilvl w:val="0"/>
+          <w:numId w:val="16"/>
+        </w:numPr>
         <w:pStyle w:val="ListNumber"/>
       </w:pPr>
       <w:r>
@@ -1432,6 +1488,10 @@
     </w:p>
     <w:p>
       <w:pPr>
+        <w:numPr>
+          <w:ilvl w:val="0"/>
+          <w:numId w:val="16"/>
+        </w:numPr>
         <w:pStyle w:val="ListNumber"/>
       </w:pPr>
       <w:r>
@@ -1440,6 +1500,10 @@
     </w:p>
     <w:p>
       <w:pPr>
+        <w:numPr>
+          <w:ilvl w:val="0"/>
+          <w:numId w:val="16"/>
+        </w:numPr>
         <w:pStyle w:val="ListNumber"/>
       </w:pPr>
       <w:r>
@@ -1448,6 +1512,10 @@
     </w:p>
     <w:p>
       <w:pPr>
+        <w:numPr>
+          <w:ilvl w:val="0"/>
+          <w:numId w:val="16"/>
+        </w:numPr>
         <w:pStyle w:val="ListNumber"/>
       </w:pPr>
       <w:r>
@@ -1464,6 +1532,10 @@
     </w:p>
     <w:p>
       <w:pPr>
+        <w:numPr>
+          <w:ilvl w:val="0"/>
+          <w:numId w:val="17"/>
+        </w:numPr>
         <w:pStyle w:val="ListNumber"/>
       </w:pPr>
       <w:r>
@@ -1472,6 +1544,10 @@
     </w:p>
     <w:p>
       <w:pPr>
+        <w:numPr>
+          <w:ilvl w:val="0"/>
+          <w:numId w:val="17"/>
+        </w:numPr>
         <w:pStyle w:val="ListNumber"/>
       </w:pPr>
       <w:r>
@@ -1480,6 +1556,10 @@
     </w:p>
     <w:p>
       <w:pPr>
+        <w:numPr>
+          <w:ilvl w:val="0"/>
+          <w:numId w:val="17"/>
+        </w:numPr>
         <w:pStyle w:val="ListNumber"/>
       </w:pPr>
       <w:r>
@@ -1498,7 +1578,7 @@
       <w:pPr>
         <w:numPr>
           <w:ilvl w:val="0"/>
-          <w:numId w:val="10"/>
+          <w:numId w:val="18"/>
         </w:numPr>
         <w:pStyle w:val="ListNumber"/>
       </w:pPr>
@@ -1755,6 +1835,54 @@
     <w:abstractNumId w:val="0"/>
   </w:num>
   <w:num w:numId="10">
+    <w:abstractNumId w:val="7"/>
+    <w:lvlOverride w:ilvl="0">
+      <w:startOverride w:val="1"/>
+    </w:lvlOverride>
+  </w:num>
+  <w:num w:numId="11">
+    <w:abstractNumId w:val="7"/>
+    <w:lvlOverride w:ilvl="0">
+      <w:startOverride w:val="1"/>
+    </w:lvlOverride>
+  </w:num>
+  <w:num w:numId="12">
+    <w:abstractNumId w:val="7"/>
+    <w:lvlOverride w:ilvl="0">
+      <w:startOverride w:val="1"/>
+    </w:lvlOverride>
+  </w:num>
+  <w:num w:numId="13">
+    <w:abstractNumId w:val="7"/>
+    <w:lvlOverride w:ilvl="0">
+      <w:startOverride w:val="1"/>
+    </w:lvlOverride>
+  </w:num>
+  <w:num w:numId="14">
+    <w:abstractNumId w:val="7"/>
+    <w:lvlOverride w:ilvl="0">
+      <w:startOverride w:val="1"/>
+    </w:lvlOverride>
+  </w:num>
+  <w:num w:numId="15">
+    <w:abstractNumId w:val="7"/>
+    <w:lvlOverride w:ilvl="0">
+      <w:startOverride w:val="1"/>
+    </w:lvlOverride>
+  </w:num>
+  <w:num w:numId="16">
+    <w:abstractNumId w:val="7"/>
+    <w:lvlOverride w:ilvl="0">
+      <w:startOverride w:val="1"/>
+    </w:lvlOverride>
+  </w:num>
+  <w:num w:numId="17">
+    <w:abstractNumId w:val="7"/>
+    <w:lvlOverride w:ilvl="0">
+      <w:startOverride w:val="1"/>
+    </w:lvlOverride>
+  </w:num>
+  <w:num w:numId="18">
     <w:abstractNumId w:val="7"/>
     <w:lvlOverride w:ilvl="0">
       <w:startOverride w:val="1"/>

</xml_diff>